<commit_message>
Sync resume Honors with about.md; document English-only CV rule
Honors added from _pages/about.md to both CV files (reverse-chrono):
- Sigmod 2026 Distinguished PC Member, 2026
- Sigmod 2026 Distinguished Reviewer, 2026
- VLDB 2025 Distinguished Reviewer Award, 2025

Honors added to cv-full.docx only (cv-short stays curated):
- Best paper award, EDB 2013, August 2013
- Silver Paper Contribution Award, KIISE, June 2012 (translated from
  Korean original 논문공헌상 SILVER per English-only CV rule)
- The Marquis' Who's Who in the World

CLAUDE.md: added the English-only rule for resume/*.docx — Korean
entries on the homepage must be translated to English when mirrored
into cv-short.docx / cv-full.docx.
</commit_message>
<xml_diff>
--- a/resume/cv-full.docx
+++ b/resume/cv-full.docx
@@ -2104,6 +2104,34 @@
         <w:rPr>
           <w:rFonts w:ascii="Times New Roman" w:hint="eastAsia"/>
         </w:rPr>
+        <w:t xml:space="preserve">Sigmod 2026 Distinguished PC Member, 2026</w:t>
+      </w:r>
+    </w:p>
+    <w:p>
+      <w:pPr>
+        <w:ind w:leftChars="180" w:left="1260" w:hangingChars="450" w:hanging="900"/>
+        <w:rPr>
+          <w:rFonts w:ascii="Times New Roman"/>
+        </w:rPr>
+      </w:pPr>
+      <w:r>
+        <w:rPr>
+          <w:rFonts w:ascii="Times New Roman" w:hint="eastAsia"/>
+        </w:rPr>
+        <w:t xml:space="preserve">Sigmod 2026 Distinguished Reviewer, 2026</w:t>
+      </w:r>
+    </w:p>
+    <w:p>
+      <w:pPr>
+        <w:ind w:leftChars="180" w:left="1260" w:hangingChars="450" w:hanging="900"/>
+        <w:rPr>
+          <w:rFonts w:ascii="Times New Roman"/>
+        </w:rPr>
+      </w:pPr>
+      <w:r>
+        <w:rPr>
+          <w:rFonts w:ascii="Times New Roman" w:hint="eastAsia"/>
+        </w:rPr>
         <w:t>ICML 2026 Gold Reviewer, 2026</w:t>
       </w:r>
     </w:p>
@@ -2164,6 +2192,20 @@
         <w:rPr>
           <w:rFonts w:ascii="Times New Roman"/>
         </w:rPr>
+        <w:t xml:space="preserve">VLDB 2025 Distinguished Reviewer Award, 2025</w:t>
+      </w:r>
+    </w:p>
+    <w:p>
+      <w:pPr>
+        <w:ind w:leftChars="180" w:left="1260" w:hangingChars="450" w:hanging="900"/>
+        <w:rPr>
+          <w:rFonts w:ascii="Times New Roman"/>
+        </w:rPr>
+      </w:pPr>
+      <w:r>
+        <w:rPr>
+          <w:rFonts w:ascii="Times New Roman"/>
+        </w:rPr>
         <w:t xml:space="preserve">Neurips </w:t>
       </w:r>
       <w:r>
@@ -2486,6 +2528,34 @@
       </w:pPr>
       <w:r>
         <w:rPr>
+          <w:rFonts w:ascii="Times New Roman"/>
+        </w:rPr>
+        <w:t xml:space="preserve">Best paper award, The Fifth International Conference on Emerging Databases-Technologies, Applications, and Theory (EDB 2013), August 2013</w:t>
+      </w:r>
+    </w:p>
+    <w:p>
+      <w:pPr>
+        <w:ind w:leftChars="180" w:left="1260" w:hangingChars="450" w:hanging="900"/>
+        <w:rPr>
+          <w:rFonts w:ascii="Times New Roman" w:hint="eastAsia"/>
+        </w:rPr>
+      </w:pPr>
+      <w:r>
+        <w:rPr>
+          <w:rFonts w:ascii="Times New Roman"/>
+        </w:rPr>
+        <w:t>Silver Paper Contribution Award, The Korean Institute of Information Scientists and Engineers (KIISE), June 2012</w:t>
+      </w:r>
+    </w:p>
+    <w:p>
+      <w:pPr>
+        <w:ind w:leftChars="180" w:left="1260" w:hangingChars="450" w:hanging="900"/>
+        <w:rPr>
+          <w:rFonts w:ascii="Times New Roman" w:hint="eastAsia"/>
+        </w:rPr>
+      </w:pPr>
+      <w:r>
+        <w:rPr>
           <w:rFonts w:ascii="Times New Roman" w:hint="eastAsia"/>
         </w:rPr>
         <w:t>The iGraph paper has been invited to the VLDB Journal as b</w:t>
@@ -2647,6 +2717,23 @@
           <w:rFonts w:ascii="Times New Roman"/>
         </w:rPr>
         <w:t>in Computer Science)</w:t>
+      </w:r>
+    </w:p>
+    <w:p>
+      <w:pPr>
+        <w:numPr>
+          <w:ilvl w:val="0"/>
+          <w:numId w:val="2"/>
+        </w:numPr>
+        <w:rPr>
+          <w:rFonts w:ascii="Times New Roman"/>
+        </w:rPr>
+      </w:pPr>
+      <w:r>
+        <w:rPr>
+          <w:rFonts w:ascii="Times New Roman"/>
+        </w:rPr>
+        <w:t xml:space="preserve">The Marquis’ Who’s Who in the World</w:t>
       </w:r>
     </w:p>
     <w:p>

</xml_diff>

<commit_message>
Remove duplicate 'Sigmod 2026 Distinguished Reviewer' honor
Same award as 'Sigmod 2026 Distinguished PC Member'. Removed from
about.md and both CV files per the sync rule.
</commit_message>
<xml_diff>
--- a/resume/cv-full.docx
+++ b/resume/cv-full.docx
@@ -2105,20 +2105,6 @@
           <w:rFonts w:ascii="Times New Roman" w:hint="eastAsia"/>
         </w:rPr>
         <w:t xml:space="preserve">Sigmod 2026 Distinguished PC Member, 2026</w:t>
-      </w:r>
-    </w:p>
-    <w:p>
-      <w:pPr>
-        <w:ind w:leftChars="180" w:left="1260" w:hangingChars="450" w:hanging="900"/>
-        <w:rPr>
-          <w:rFonts w:ascii="Times New Roman"/>
-        </w:rPr>
-      </w:pPr>
-      <w:r>
-        <w:rPr>
-          <w:rFonts w:ascii="Times New Roman" w:hint="eastAsia"/>
-        </w:rPr>
-        <w:t xml:space="preserve">Sigmod 2026 Distinguished Reviewer, 2026</w:t>
       </w:r>
     </w:p>
     <w:p>

</xml_diff>